<commit_message>
add {remove?} feature to remove the added shape completely when the tag has falsy values for pptx and update element template and output file and tsconfig.json
</commit_message>
<xml_diff>
--- a/BeginersGuide/UsingElements/data/docxElements_template.docx
+++ b/BeginersGuide/UsingElements/data/docxElements_template.docx
@@ -1,6 +1,6 @@
 
 <file path=word/document.xml><?xml version="1.0" encoding="utf-8"?>
-<w:document xmlns:wpc="http://schemas.microsoft.com/office/word/2010/wordprocessingCanvas" xmlns:cx="http://schemas.microsoft.com/office/drawing/2014/chartex" xmlns:cx1="http://schemas.microsoft.com/office/drawing/2015/9/8/chartex" xmlns:cx2="http://schemas.microsoft.com/office/drawing/2015/10/21/chartex" xmlns:cx3="http://schemas.microsoft.com/office/drawing/2016/5/9/chartex" xmlns:cx4="http://schemas.microsoft.com/office/drawing/2016/5/10/chartex" xmlns:cx5="http://schemas.microsoft.com/office/drawing/2016/5/11/chartex" xmlns:cx6="http://schemas.microsoft.com/office/drawing/2016/5/12/chartex" xmlns:cx7="http://schemas.microsoft.com/office/drawing/2016/5/13/chartex" xmlns:cx8="http://schemas.microsoft.com/office/drawing/2016/5/14/chartex" xmlns:mc="http://schemas.openxmlformats.org/markup-compatibility/2006" xmlns:aink="http://schemas.microsoft.com/office/drawing/2016/ink" xmlns:am3d="http://schemas.microsoft.com/office/drawing/2017/model3d" xmlns:o="urn:schemas-microsoft-com:office:office" xmlns:r="http://schemas.openxmlformats.org/officeDocument/2006/relationships" xmlns:m="http://schemas.openxmlformats.org/officeDocument/2006/math" xmlns:v="urn:schemas-microsoft-com:vml" xmlns:wp14="http://schemas.microsoft.com/office/word/2010/wordprocessingDrawing" xmlns:wp="http://schemas.openxmlformats.org/drawingml/2006/wordprocessingDrawing" xmlns:w10="urn:schemas-microsoft-com:office:word" xmlns:w="http://schemas.openxmlformats.org/wordprocessingml/2006/main" xmlns:w14="http://schemas.microsoft.com/office/word/2010/wordml" xmlns:w15="http://schemas.microsoft.com/office/word/2012/wordml" xmlns:w16cex="http://schemas.microsoft.com/office/word/2018/wordml/cex" xmlns:w16cid="http://schemas.microsoft.com/office/word/2016/wordml/cid" xmlns:w16="http://schemas.microsoft.com/office/word/2018/wordml" xmlns:w16sdtdh="http://schemas.microsoft.com/office/word/2020/wordml/sdtdatahash" xmlns:w16se="http://schemas.microsoft.com/office/word/2015/wordml/symex" xmlns:wpg="http://schemas.microsoft.com/office/word/2010/wordprocessingGroup" xmlns:wpi="http://schemas.microsoft.com/office/word/2010/wordprocessingInk" xmlns:wne="http://schemas.microsoft.com/office/word/2006/wordml" xmlns:wps="http://schemas.microsoft.com/office/word/2010/wordprocessingShape" mc:Ignorable="w14 w15 w16se w16cid w16 w16cex w16sdtdh wp14">
+<w:document xmlns:wpc="http://schemas.microsoft.com/office/word/2010/wordprocessingCanvas" xmlns:cx="http://schemas.microsoft.com/office/drawing/2014/chartex" xmlns:cx1="http://schemas.microsoft.com/office/drawing/2015/9/8/chartex" xmlns:cx2="http://schemas.microsoft.com/office/drawing/2015/10/21/chartex" xmlns:cx3="http://schemas.microsoft.com/office/drawing/2016/5/9/chartex" xmlns:cx4="http://schemas.microsoft.com/office/drawing/2016/5/10/chartex" xmlns:cx5="http://schemas.microsoft.com/office/drawing/2016/5/11/chartex" xmlns:cx6="http://schemas.microsoft.com/office/drawing/2016/5/12/chartex" xmlns:cx7="http://schemas.microsoft.com/office/drawing/2016/5/13/chartex" xmlns:cx8="http://schemas.microsoft.com/office/drawing/2016/5/14/chartex" xmlns:mc="http://schemas.openxmlformats.org/markup-compatibility/2006" xmlns:aink="http://schemas.microsoft.com/office/drawing/2016/ink" xmlns:am3d="http://schemas.microsoft.com/office/drawing/2017/model3d" xmlns:o="urn:schemas-microsoft-com:office:office" xmlns:oel="http://schemas.microsoft.com/office/2019/extlst" xmlns:r="http://schemas.openxmlformats.org/officeDocument/2006/relationships" xmlns:m="http://schemas.openxmlformats.org/officeDocument/2006/math" xmlns:v="urn:schemas-microsoft-com:vml" xmlns:wp14="http://schemas.microsoft.com/office/word/2010/wordprocessingDrawing" xmlns:wp="http://schemas.openxmlformats.org/drawingml/2006/wordprocessingDrawing" xmlns:w10="urn:schemas-microsoft-com:office:word" xmlns:w="http://schemas.openxmlformats.org/wordprocessingml/2006/main" xmlns:w14="http://schemas.microsoft.com/office/word/2010/wordml" xmlns:w15="http://schemas.microsoft.com/office/word/2012/wordml" xmlns:w16cex="http://schemas.microsoft.com/office/word/2018/wordml/cex" xmlns:w16cid="http://schemas.microsoft.com/office/word/2016/wordml/cid" xmlns:w16="http://schemas.microsoft.com/office/word/2018/wordml" xmlns:w16du="http://schemas.microsoft.com/office/word/2023/wordml/word16du" xmlns:w16sdtdh="http://schemas.microsoft.com/office/word/2020/wordml/sdtdatahash" xmlns:w16se="http://schemas.microsoft.com/office/word/2015/wordml/symex" xmlns:wpg="http://schemas.microsoft.com/office/word/2010/wordprocessingGroup" xmlns:wpi="http://schemas.microsoft.com/office/word/2010/wordprocessingInk" xmlns:wne="http://schemas.microsoft.com/office/word/2006/wordml" xmlns:wps="http://schemas.microsoft.com/office/word/2010/wordprocessingShape" mc:Ignorable="w14 w15 w16se w16cid w16 w16cex w16sdtdh w16du wp14">
   <w:body>
     <w:p>
       <w:r>
@@ -8,7 +8,7 @@
           <w:noProof/>
         </w:rPr>
         <w:drawing>
-          <wp:inline distT="0" distB="0" distL="0" distR="0">
+          <wp:inline distT="0" distB="0" distL="0" distR="0" wp14:anchorId="6F677C3B" wp14:editId="7015CCA1">
             <wp:extent cx="4189268" cy="781050"/>
             <wp:effectExtent l="0" t="0" r="0" b="0"/>
             <wp:docPr id="2" name="Picture 2"/>
@@ -106,29 +106,71 @@
           <w:sz w:val="36"/>
           <w:szCs w:val="32"/>
         </w:rPr>
-        <w:t>{style testProperty}</w:t>
+        <w:t xml:space="preserve">{style </w:t>
+      </w:r>
+      <w:proofErr w:type="spellStart"/>
+      <w:r>
+        <w:rPr>
+          <w:sz w:val="36"/>
+          <w:szCs w:val="32"/>
+        </w:rPr>
+        <w:t>testProperty</w:t>
+      </w:r>
+      <w:proofErr w:type="spellEnd"/>
+      <w:r>
+        <w:rPr>
+          <w:sz w:val="36"/>
+          <w:szCs w:val="32"/>
+        </w:rPr>
+        <w:t>}</w:t>
       </w:r>
     </w:p>
     <w:p/>
     <w:p>
-      <w:r>
-        <w:t>AutoLink-&gt;</w:t>
-      </w:r>
-    </w:p>
-    <w:p>
-      <w:r>
-        <w:t>{*auto autoLink}</w:t>
+      <w:proofErr w:type="spellStart"/>
+      <w:r>
+        <w:t>AutoLink</w:t>
+      </w:r>
+      <w:proofErr w:type="spellEnd"/>
+      <w:r>
+        <w:t>-&gt;</w:t>
+      </w:r>
+    </w:p>
+    <w:p>
+      <w:r>
+        <w:t xml:space="preserve">{*auto </w:t>
+      </w:r>
+      <w:proofErr w:type="spellStart"/>
+      <w:r>
+        <w:t>autoLink</w:t>
+      </w:r>
+      <w:proofErr w:type="spellEnd"/>
+      <w:r>
+        <w:t>}</w:t>
       </w:r>
     </w:p>
     <w:p/>
     <w:p>
-      <w:r>
-        <w:t>HyperLink-&gt;</w:t>
-      </w:r>
-    </w:p>
-    <w:p>
-      <w:r>
-        <w:t>{*linkToCOP}</w:t>
+      <w:proofErr w:type="spellStart"/>
+      <w:r>
+        <w:t>HyperLink</w:t>
+      </w:r>
+      <w:proofErr w:type="spellEnd"/>
+      <w:r>
+        <w:t>-&gt;</w:t>
+      </w:r>
+    </w:p>
+    <w:p>
+      <w:r>
+        <w:t>{*</w:t>
+      </w:r>
+      <w:proofErr w:type="spellStart"/>
+      <w:r>
+        <w:t>linkToCOP</w:t>
+      </w:r>
+      <w:proofErr w:type="spellEnd"/>
+      <w:r>
+        <w:t>}</w:t>
       </w:r>
     </w:p>
     <w:p/>
@@ -139,7 +181,15 @@
     </w:p>
     <w:p>
       <w:r>
-        <w:t>{style cust_first_name}</w:t>
+        <w:t xml:space="preserve">{style </w:t>
+      </w:r>
+      <w:proofErr w:type="spellStart"/>
+      <w:r>
+        <w:t>cust_first_name</w:t>
+      </w:r>
+      <w:proofErr w:type="spellEnd"/>
+      <w:r>
+        <w:t>}</w:t>
       </w:r>
     </w:p>
     <w:p/>
@@ -150,7 +200,15 @@
     </w:p>
     <w:p>
       <w:r>
-        <w:t>{?insert document_to_insert}</w:t>
+        <w:t xml:space="preserve">{?insert </w:t>
+      </w:r>
+      <w:proofErr w:type="spellStart"/>
+      <w:r>
+        <w:t>document_to_insert</w:t>
+      </w:r>
+      <w:proofErr w:type="spellEnd"/>
+      <w:r>
+        <w:t>}</w:t>
       </w:r>
     </w:p>
     <w:p/>
@@ -170,6 +228,86 @@
       <w:r>
         <w:t>{$d3 d3_code}</w:t>
       </w:r>
+    </w:p>
+    <w:p/>
+    <w:p>
+      <w:pPr>
+        <w:rPr>
+          <w:sz w:val="32"/>
+          <w:szCs w:val="32"/>
+        </w:rPr>
+      </w:pPr>
+      <w:r>
+        <w:rPr>
+          <w:sz w:val="32"/>
+          <w:szCs w:val="32"/>
+        </w:rPr>
+        <w:t>Border and cell style</w:t>
+      </w:r>
+    </w:p>
+    <w:p>
+      <w:pPr>
+        <w:rPr>
+          <w:sz w:val="32"/>
+          <w:szCs w:val="32"/>
+        </w:rPr>
+      </w:pPr>
+    </w:p>
+    <w:tbl>
+      <w:tblPr>
+        <w:tblStyle w:val="TableGrid"/>
+        <w:tblW w:w="0" w:type="auto"/>
+        <w:tblLook w:val="04A0" w:firstRow="1" w:lastRow="0" w:firstColumn="1" w:lastColumn="0" w:noHBand="0" w:noVBand="1"/>
+      </w:tblPr>
+      <w:tblGrid>
+        <w:gridCol w:w="9350"/>
+      </w:tblGrid>
+      <w:tr>
+        <w:tc>
+          <w:tcPr>
+            <w:tcW w:w="9350" w:type="dxa"/>
+          </w:tcPr>
+          <w:p>
+            <w:pPr>
+              <w:rPr>
+                <w:sz w:val="32"/>
+                <w:szCs w:val="32"/>
+              </w:rPr>
+            </w:pPr>
+            <w:r>
+              <w:rPr>
+                <w:sz w:val="32"/>
+                <w:szCs w:val="32"/>
+              </w:rPr>
+              <w:t>{</w:t>
+            </w:r>
+            <w:proofErr w:type="spellStart"/>
+            <w:r>
+              <w:rPr>
+                <w:sz w:val="32"/>
+                <w:szCs w:val="32"/>
+              </w:rPr>
+              <w:t>testProperty</w:t>
+            </w:r>
+            <w:proofErr w:type="spellEnd"/>
+            <w:r>
+              <w:rPr>
+                <w:sz w:val="32"/>
+                <w:szCs w:val="32"/>
+              </w:rPr>
+              <w:t>$}</w:t>
+            </w:r>
+          </w:p>
+        </w:tc>
+      </w:tr>
+    </w:tbl>
+    <w:p>
+      <w:pPr>
+        <w:rPr>
+          <w:sz w:val="32"/>
+          <w:szCs w:val="32"/>
+        </w:rPr>
+      </w:pPr>
     </w:p>
     <w:sectPr>
       <w:headerReference w:type="default" r:id="rId7"/>
@@ -183,7 +321,7 @@
 </file>
 
 <file path=word/endnotes.xml><?xml version="1.0" encoding="utf-8"?>
-<w:endnotes xmlns:wpc="http://schemas.microsoft.com/office/word/2010/wordprocessingCanvas" xmlns:cx="http://schemas.microsoft.com/office/drawing/2014/chartex" xmlns:cx1="http://schemas.microsoft.com/office/drawing/2015/9/8/chartex" xmlns:cx2="http://schemas.microsoft.com/office/drawing/2015/10/21/chartex" xmlns:cx3="http://schemas.microsoft.com/office/drawing/2016/5/9/chartex" xmlns:cx4="http://schemas.microsoft.com/office/drawing/2016/5/10/chartex" xmlns:cx5="http://schemas.microsoft.com/office/drawing/2016/5/11/chartex" xmlns:cx6="http://schemas.microsoft.com/office/drawing/2016/5/12/chartex" xmlns:cx7="http://schemas.microsoft.com/office/drawing/2016/5/13/chartex" xmlns:cx8="http://schemas.microsoft.com/office/drawing/2016/5/14/chartex" xmlns:mc="http://schemas.openxmlformats.org/markup-compatibility/2006" xmlns:aink="http://schemas.microsoft.com/office/drawing/2016/ink" xmlns:am3d="http://schemas.microsoft.com/office/drawing/2017/model3d" xmlns:o="urn:schemas-microsoft-com:office:office" xmlns:r="http://schemas.openxmlformats.org/officeDocument/2006/relationships" xmlns:m="http://schemas.openxmlformats.org/officeDocument/2006/math" xmlns:v="urn:schemas-microsoft-com:vml" xmlns:wp14="http://schemas.microsoft.com/office/word/2010/wordprocessingDrawing" xmlns:wp="http://schemas.openxmlformats.org/drawingml/2006/wordprocessingDrawing" xmlns:w10="urn:schemas-microsoft-com:office:word" xmlns:w="http://schemas.openxmlformats.org/wordprocessingml/2006/main" xmlns:w14="http://schemas.microsoft.com/office/word/2010/wordml" xmlns:w15="http://schemas.microsoft.com/office/word/2012/wordml" xmlns:w16cex="http://schemas.microsoft.com/office/word/2018/wordml/cex" xmlns:w16cid="http://schemas.microsoft.com/office/word/2016/wordml/cid" xmlns:w16="http://schemas.microsoft.com/office/word/2018/wordml" xmlns:w16sdtdh="http://schemas.microsoft.com/office/word/2020/wordml/sdtdatahash" xmlns:w16se="http://schemas.microsoft.com/office/word/2015/wordml/symex" xmlns:wpg="http://schemas.microsoft.com/office/word/2010/wordprocessingGroup" xmlns:wpi="http://schemas.microsoft.com/office/word/2010/wordprocessingInk" xmlns:wne="http://schemas.microsoft.com/office/word/2006/wordml" xmlns:wps="http://schemas.microsoft.com/office/word/2010/wordprocessingShape" mc:Ignorable="w14 w15 w16se w16cid w16 w16cex w16sdtdh wp14">
+<w:endnotes xmlns:wpc="http://schemas.microsoft.com/office/word/2010/wordprocessingCanvas" xmlns:cx="http://schemas.microsoft.com/office/drawing/2014/chartex" xmlns:cx1="http://schemas.microsoft.com/office/drawing/2015/9/8/chartex" xmlns:cx2="http://schemas.microsoft.com/office/drawing/2015/10/21/chartex" xmlns:cx3="http://schemas.microsoft.com/office/drawing/2016/5/9/chartex" xmlns:cx4="http://schemas.microsoft.com/office/drawing/2016/5/10/chartex" xmlns:cx5="http://schemas.microsoft.com/office/drawing/2016/5/11/chartex" xmlns:cx6="http://schemas.microsoft.com/office/drawing/2016/5/12/chartex" xmlns:cx7="http://schemas.microsoft.com/office/drawing/2016/5/13/chartex" xmlns:cx8="http://schemas.microsoft.com/office/drawing/2016/5/14/chartex" xmlns:mc="http://schemas.openxmlformats.org/markup-compatibility/2006" xmlns:aink="http://schemas.microsoft.com/office/drawing/2016/ink" xmlns:am3d="http://schemas.microsoft.com/office/drawing/2017/model3d" xmlns:o="urn:schemas-microsoft-com:office:office" xmlns:oel="http://schemas.microsoft.com/office/2019/extlst" xmlns:r="http://schemas.openxmlformats.org/officeDocument/2006/relationships" xmlns:m="http://schemas.openxmlformats.org/officeDocument/2006/math" xmlns:v="urn:schemas-microsoft-com:vml" xmlns:wp14="http://schemas.microsoft.com/office/word/2010/wordprocessingDrawing" xmlns:wp="http://schemas.openxmlformats.org/drawingml/2006/wordprocessingDrawing" xmlns:w10="urn:schemas-microsoft-com:office:word" xmlns:w="http://schemas.openxmlformats.org/wordprocessingml/2006/main" xmlns:w14="http://schemas.microsoft.com/office/word/2010/wordml" xmlns:w15="http://schemas.microsoft.com/office/word/2012/wordml" xmlns:w16cex="http://schemas.microsoft.com/office/word/2018/wordml/cex" xmlns:w16cid="http://schemas.microsoft.com/office/word/2016/wordml/cid" xmlns:w16="http://schemas.microsoft.com/office/word/2018/wordml" xmlns:w16du="http://schemas.microsoft.com/office/word/2023/wordml/word16du" xmlns:w16sdtdh="http://schemas.microsoft.com/office/word/2020/wordml/sdtdatahash" xmlns:w16se="http://schemas.microsoft.com/office/word/2015/wordml/symex" xmlns:wpg="http://schemas.microsoft.com/office/word/2010/wordprocessingGroup" xmlns:wpi="http://schemas.microsoft.com/office/word/2010/wordprocessingInk" xmlns:wne="http://schemas.microsoft.com/office/word/2006/wordml" xmlns:wps="http://schemas.microsoft.com/office/word/2010/wordprocessingShape" mc:Ignorable="w14 w15 w16se w16cid w16 w16cex w16sdtdh w16du wp14">
   <w:endnote w:type="separator" w:id="-1">
     <w:p>
       <w:pPr>
@@ -208,7 +346,7 @@
 </file>
 
 <file path=word/footnotes.xml><?xml version="1.0" encoding="utf-8"?>
-<w:footnotes xmlns:wpc="http://schemas.microsoft.com/office/word/2010/wordprocessingCanvas" xmlns:cx="http://schemas.microsoft.com/office/drawing/2014/chartex" xmlns:cx1="http://schemas.microsoft.com/office/drawing/2015/9/8/chartex" xmlns:cx2="http://schemas.microsoft.com/office/drawing/2015/10/21/chartex" xmlns:cx3="http://schemas.microsoft.com/office/drawing/2016/5/9/chartex" xmlns:cx4="http://schemas.microsoft.com/office/drawing/2016/5/10/chartex" xmlns:cx5="http://schemas.microsoft.com/office/drawing/2016/5/11/chartex" xmlns:cx6="http://schemas.microsoft.com/office/drawing/2016/5/12/chartex" xmlns:cx7="http://schemas.microsoft.com/office/drawing/2016/5/13/chartex" xmlns:cx8="http://schemas.microsoft.com/office/drawing/2016/5/14/chartex" xmlns:mc="http://schemas.openxmlformats.org/markup-compatibility/2006" xmlns:aink="http://schemas.microsoft.com/office/drawing/2016/ink" xmlns:am3d="http://schemas.microsoft.com/office/drawing/2017/model3d" xmlns:o="urn:schemas-microsoft-com:office:office" xmlns:r="http://schemas.openxmlformats.org/officeDocument/2006/relationships" xmlns:m="http://schemas.openxmlformats.org/officeDocument/2006/math" xmlns:v="urn:schemas-microsoft-com:vml" xmlns:wp14="http://schemas.microsoft.com/office/word/2010/wordprocessingDrawing" xmlns:wp="http://schemas.openxmlformats.org/drawingml/2006/wordprocessingDrawing" xmlns:w10="urn:schemas-microsoft-com:office:word" xmlns:w="http://schemas.openxmlformats.org/wordprocessingml/2006/main" xmlns:w14="http://schemas.microsoft.com/office/word/2010/wordml" xmlns:w15="http://schemas.microsoft.com/office/word/2012/wordml" xmlns:w16cex="http://schemas.microsoft.com/office/word/2018/wordml/cex" xmlns:w16cid="http://schemas.microsoft.com/office/word/2016/wordml/cid" xmlns:w16="http://schemas.microsoft.com/office/word/2018/wordml" xmlns:w16sdtdh="http://schemas.microsoft.com/office/word/2020/wordml/sdtdatahash" xmlns:w16se="http://schemas.microsoft.com/office/word/2015/wordml/symex" xmlns:wpg="http://schemas.microsoft.com/office/word/2010/wordprocessingGroup" xmlns:wpi="http://schemas.microsoft.com/office/word/2010/wordprocessingInk" xmlns:wne="http://schemas.microsoft.com/office/word/2006/wordml" xmlns:wps="http://schemas.microsoft.com/office/word/2010/wordprocessingShape" mc:Ignorable="w14 w15 w16se w16cid w16 w16cex w16sdtdh wp14">
+<w:footnotes xmlns:wpc="http://schemas.microsoft.com/office/word/2010/wordprocessingCanvas" xmlns:cx="http://schemas.microsoft.com/office/drawing/2014/chartex" xmlns:cx1="http://schemas.microsoft.com/office/drawing/2015/9/8/chartex" xmlns:cx2="http://schemas.microsoft.com/office/drawing/2015/10/21/chartex" xmlns:cx3="http://schemas.microsoft.com/office/drawing/2016/5/9/chartex" xmlns:cx4="http://schemas.microsoft.com/office/drawing/2016/5/10/chartex" xmlns:cx5="http://schemas.microsoft.com/office/drawing/2016/5/11/chartex" xmlns:cx6="http://schemas.microsoft.com/office/drawing/2016/5/12/chartex" xmlns:cx7="http://schemas.microsoft.com/office/drawing/2016/5/13/chartex" xmlns:cx8="http://schemas.microsoft.com/office/drawing/2016/5/14/chartex" xmlns:mc="http://schemas.openxmlformats.org/markup-compatibility/2006" xmlns:aink="http://schemas.microsoft.com/office/drawing/2016/ink" xmlns:am3d="http://schemas.microsoft.com/office/drawing/2017/model3d" xmlns:o="urn:schemas-microsoft-com:office:office" xmlns:oel="http://schemas.microsoft.com/office/2019/extlst" xmlns:r="http://schemas.openxmlformats.org/officeDocument/2006/relationships" xmlns:m="http://schemas.openxmlformats.org/officeDocument/2006/math" xmlns:v="urn:schemas-microsoft-com:vml" xmlns:wp14="http://schemas.microsoft.com/office/word/2010/wordprocessingDrawing" xmlns:wp="http://schemas.openxmlformats.org/drawingml/2006/wordprocessingDrawing" xmlns:w10="urn:schemas-microsoft-com:office:word" xmlns:w="http://schemas.openxmlformats.org/wordprocessingml/2006/main" xmlns:w14="http://schemas.microsoft.com/office/word/2010/wordml" xmlns:w15="http://schemas.microsoft.com/office/word/2012/wordml" xmlns:w16cex="http://schemas.microsoft.com/office/word/2018/wordml/cex" xmlns:w16cid="http://schemas.microsoft.com/office/word/2016/wordml/cid" xmlns:w16="http://schemas.microsoft.com/office/word/2018/wordml" xmlns:w16du="http://schemas.microsoft.com/office/word/2023/wordml/word16du" xmlns:w16sdtdh="http://schemas.microsoft.com/office/word/2020/wordml/sdtdatahash" xmlns:w16se="http://schemas.microsoft.com/office/word/2015/wordml/symex" xmlns:wpg="http://schemas.microsoft.com/office/word/2010/wordprocessingGroup" xmlns:wpi="http://schemas.microsoft.com/office/word/2010/wordprocessingInk" xmlns:wne="http://schemas.microsoft.com/office/word/2006/wordml" xmlns:wps="http://schemas.microsoft.com/office/word/2010/wordprocessingShape" mc:Ignorable="w14 w15 w16se w16cid w16 w16cex w16sdtdh w16du wp14">
   <w:footnote w:type="separator" w:id="-1">
     <w:p>
       <w:pPr>
@@ -233,20 +371,28 @@
 </file>
 
 <file path=word/header1.xml><?xml version="1.0" encoding="utf-8"?>
-<w:hdr xmlns:wpc="http://schemas.microsoft.com/office/word/2010/wordprocessingCanvas" xmlns:cx="http://schemas.microsoft.com/office/drawing/2014/chartex" xmlns:cx1="http://schemas.microsoft.com/office/drawing/2015/9/8/chartex" xmlns:cx2="http://schemas.microsoft.com/office/drawing/2015/10/21/chartex" xmlns:cx3="http://schemas.microsoft.com/office/drawing/2016/5/9/chartex" xmlns:cx4="http://schemas.microsoft.com/office/drawing/2016/5/10/chartex" xmlns:cx5="http://schemas.microsoft.com/office/drawing/2016/5/11/chartex" xmlns:cx6="http://schemas.microsoft.com/office/drawing/2016/5/12/chartex" xmlns:cx7="http://schemas.microsoft.com/office/drawing/2016/5/13/chartex" xmlns:cx8="http://schemas.microsoft.com/office/drawing/2016/5/14/chartex" xmlns:mc="http://schemas.openxmlformats.org/markup-compatibility/2006" xmlns:aink="http://schemas.microsoft.com/office/drawing/2016/ink" xmlns:am3d="http://schemas.microsoft.com/office/drawing/2017/model3d" xmlns:o="urn:schemas-microsoft-com:office:office" xmlns:r="http://schemas.openxmlformats.org/officeDocument/2006/relationships" xmlns:m="http://schemas.openxmlformats.org/officeDocument/2006/math" xmlns:v="urn:schemas-microsoft-com:vml" xmlns:wp14="http://schemas.microsoft.com/office/word/2010/wordprocessingDrawing" xmlns:wp="http://schemas.openxmlformats.org/drawingml/2006/wordprocessingDrawing" xmlns:w10="urn:schemas-microsoft-com:office:word" xmlns:w="http://schemas.openxmlformats.org/wordprocessingml/2006/main" xmlns:w14="http://schemas.microsoft.com/office/word/2010/wordml" xmlns:w15="http://schemas.microsoft.com/office/word/2012/wordml" xmlns:w16cex="http://schemas.microsoft.com/office/word/2018/wordml/cex" xmlns:w16cid="http://schemas.microsoft.com/office/word/2016/wordml/cid" xmlns:w16="http://schemas.microsoft.com/office/word/2018/wordml" xmlns:w16sdtdh="http://schemas.microsoft.com/office/word/2020/wordml/sdtdatahash" xmlns:w16se="http://schemas.microsoft.com/office/word/2015/wordml/symex" xmlns:wpg="http://schemas.microsoft.com/office/word/2010/wordprocessingGroup" xmlns:wpi="http://schemas.microsoft.com/office/word/2010/wordprocessingInk" xmlns:wne="http://schemas.microsoft.com/office/word/2006/wordml" xmlns:wps="http://schemas.microsoft.com/office/word/2010/wordprocessingShape" mc:Ignorable="w14 w15 w16se w16cid w16 w16cex w16sdtdh wp14">
+<w:hdr xmlns:wpc="http://schemas.microsoft.com/office/word/2010/wordprocessingCanvas" xmlns:cx="http://schemas.microsoft.com/office/drawing/2014/chartex" xmlns:cx1="http://schemas.microsoft.com/office/drawing/2015/9/8/chartex" xmlns:cx2="http://schemas.microsoft.com/office/drawing/2015/10/21/chartex" xmlns:cx3="http://schemas.microsoft.com/office/drawing/2016/5/9/chartex" xmlns:cx4="http://schemas.microsoft.com/office/drawing/2016/5/10/chartex" xmlns:cx5="http://schemas.microsoft.com/office/drawing/2016/5/11/chartex" xmlns:cx6="http://schemas.microsoft.com/office/drawing/2016/5/12/chartex" xmlns:cx7="http://schemas.microsoft.com/office/drawing/2016/5/13/chartex" xmlns:cx8="http://schemas.microsoft.com/office/drawing/2016/5/14/chartex" xmlns:mc="http://schemas.openxmlformats.org/markup-compatibility/2006" xmlns:aink="http://schemas.microsoft.com/office/drawing/2016/ink" xmlns:am3d="http://schemas.microsoft.com/office/drawing/2017/model3d" xmlns:o="urn:schemas-microsoft-com:office:office" xmlns:oel="http://schemas.microsoft.com/office/2019/extlst" xmlns:r="http://schemas.openxmlformats.org/officeDocument/2006/relationships" xmlns:m="http://schemas.openxmlformats.org/officeDocument/2006/math" xmlns:v="urn:schemas-microsoft-com:vml" xmlns:wp14="http://schemas.microsoft.com/office/word/2010/wordprocessingDrawing" xmlns:wp="http://schemas.openxmlformats.org/drawingml/2006/wordprocessingDrawing" xmlns:w10="urn:schemas-microsoft-com:office:word" xmlns:w="http://schemas.openxmlformats.org/wordprocessingml/2006/main" xmlns:w14="http://schemas.microsoft.com/office/word/2010/wordml" xmlns:w15="http://schemas.microsoft.com/office/word/2012/wordml" xmlns:w16cex="http://schemas.microsoft.com/office/word/2018/wordml/cex" xmlns:w16cid="http://schemas.microsoft.com/office/word/2016/wordml/cid" xmlns:w16="http://schemas.microsoft.com/office/word/2018/wordml" xmlns:w16du="http://schemas.microsoft.com/office/word/2023/wordml/word16du" xmlns:w16sdtdh="http://schemas.microsoft.com/office/word/2020/wordml/sdtdatahash" xmlns:w16se="http://schemas.microsoft.com/office/word/2015/wordml/symex" xmlns:wpg="http://schemas.microsoft.com/office/word/2010/wordprocessingGroup" xmlns:wpi="http://schemas.microsoft.com/office/word/2010/wordprocessingInk" xmlns:wne="http://schemas.microsoft.com/office/word/2006/wordml" xmlns:wps="http://schemas.microsoft.com/office/word/2010/wordprocessingShape" mc:Ignorable="w14 w15 w16se w16cid w16 w16cex w16sdtdh w16du wp14">
   <w:p>
     <w:pPr>
       <w:pStyle w:val="Header"/>
     </w:pPr>
     <w:r>
-      <w:t>{watermark wm_name}</w:t>
+      <w:t xml:space="preserve">{watermark </w:t>
+    </w:r>
+    <w:proofErr w:type="spellStart"/>
+    <w:r>
+      <w:t>wm_name</w:t>
+    </w:r>
+    <w:proofErr w:type="spellEnd"/>
+    <w:r>
+      <w:t>}</w:t>
     </w:r>
   </w:p>
 </w:hdr>
 </file>
 
 <file path=word/styles.xml><?xml version="1.0" encoding="utf-8"?>
-<w:styles xmlns:mc="http://schemas.openxmlformats.org/markup-compatibility/2006" xmlns:r="http://schemas.openxmlformats.org/officeDocument/2006/relationships" xmlns:w="http://schemas.openxmlformats.org/wordprocessingml/2006/main" xmlns:w14="http://schemas.microsoft.com/office/word/2010/wordml" xmlns:w15="http://schemas.microsoft.com/office/word/2012/wordml" xmlns:w16cex="http://schemas.microsoft.com/office/word/2018/wordml/cex" xmlns:w16cid="http://schemas.microsoft.com/office/word/2016/wordml/cid" xmlns:w16="http://schemas.microsoft.com/office/word/2018/wordml" xmlns:w16sdtdh="http://schemas.microsoft.com/office/word/2020/wordml/sdtdatahash" xmlns:w16se="http://schemas.microsoft.com/office/word/2015/wordml/symex" mc:Ignorable="w14 w15 w16se w16cid w16 w16cex w16sdtdh">
+<w:styles xmlns:mc="http://schemas.openxmlformats.org/markup-compatibility/2006" xmlns:r="http://schemas.openxmlformats.org/officeDocument/2006/relationships" xmlns:w="http://schemas.openxmlformats.org/wordprocessingml/2006/main" xmlns:w14="http://schemas.microsoft.com/office/word/2010/wordml" xmlns:w15="http://schemas.microsoft.com/office/word/2012/wordml" xmlns:w16cex="http://schemas.microsoft.com/office/word/2018/wordml/cex" xmlns:w16cid="http://schemas.microsoft.com/office/word/2016/wordml/cid" xmlns:w16="http://schemas.microsoft.com/office/word/2018/wordml" xmlns:w16du="http://schemas.microsoft.com/office/word/2023/wordml/word16du" xmlns:w16sdtdh="http://schemas.microsoft.com/office/word/2020/wordml/sdtdatahash" xmlns:w16se="http://schemas.microsoft.com/office/word/2015/wordml/symex" mc:Ignorable="w14 w15 w16se w16cid w16 w16cex w16sdtdh w16du">
   <w:docDefaults>
     <w:rPrDefault>
       <w:rPr>
@@ -646,7 +792,6 @@
   <w:style w:type="character" w:default="1" w:styleId="DefaultParagraphFont">
     <w:name w:val="Default Paragraph Font"/>
     <w:uiPriority w:val="1"/>
-    <w:semiHidden/>
     <w:unhideWhenUsed/>
   </w:style>
   <w:style w:type="table" w:default="1" w:styleId="TableNormal">
@@ -730,6 +875,25 @@
     <w:basedOn w:val="DefaultParagraphFont"/>
     <w:link w:val="Footer"/>
     <w:uiPriority w:val="99"/>
+  </w:style>
+  <w:style w:type="table" w:styleId="TableGrid">
+    <w:name w:val="Table Grid"/>
+    <w:basedOn w:val="TableNormal"/>
+    <w:uiPriority w:val="39"/>
+    <w:rsid w:val="006A6CF1"/>
+    <w:pPr>
+      <w:spacing w:after="0" w:line="240" w:lineRule="auto"/>
+    </w:pPr>
+    <w:tblPr>
+      <w:tblBorders>
+        <w:top w:val="single" w:sz="4" w:space="0" w:color="auto"/>
+        <w:left w:val="single" w:sz="4" w:space="0" w:color="auto"/>
+        <w:bottom w:val="single" w:sz="4" w:space="0" w:color="auto"/>
+        <w:right w:val="single" w:sz="4" w:space="0" w:color="auto"/>
+        <w:insideH w:val="single" w:sz="4" w:space="0" w:color="auto"/>
+        <w:insideV w:val="single" w:sz="4" w:space="0" w:color="auto"/>
+      </w:tblBorders>
+    </w:tblPr>
   </w:style>
 </w:styles>
 </file>

</xml_diff>

<commit_message>
Add example for Raw Tag
</commit_message>
<xml_diff>
--- a/BeginersGuide/UsingElements/data/docxElements_template.docx
+++ b/BeginersGuide/UsingElements/data/docxElements_template.docx
@@ -1,6 +1,6 @@
 
 <file path=word/document.xml><?xml version="1.0" encoding="utf-8"?>
-<w:document xmlns:wpc="http://schemas.microsoft.com/office/word/2010/wordprocessingCanvas" xmlns:cx="http://schemas.microsoft.com/office/drawing/2014/chartex" xmlns:cx1="http://schemas.microsoft.com/office/drawing/2015/9/8/chartex" xmlns:cx2="http://schemas.microsoft.com/office/drawing/2015/10/21/chartex" xmlns:cx3="http://schemas.microsoft.com/office/drawing/2016/5/9/chartex" xmlns:cx4="http://schemas.microsoft.com/office/drawing/2016/5/10/chartex" xmlns:cx5="http://schemas.microsoft.com/office/drawing/2016/5/11/chartex" xmlns:cx6="http://schemas.microsoft.com/office/drawing/2016/5/12/chartex" xmlns:cx7="http://schemas.microsoft.com/office/drawing/2016/5/13/chartex" xmlns:cx8="http://schemas.microsoft.com/office/drawing/2016/5/14/chartex" xmlns:mc="http://schemas.openxmlformats.org/markup-compatibility/2006" xmlns:aink="http://schemas.microsoft.com/office/drawing/2016/ink" xmlns:am3d="http://schemas.microsoft.com/office/drawing/2017/model3d" xmlns:o="urn:schemas-microsoft-com:office:office" xmlns:oel="http://schemas.microsoft.com/office/2019/extlst" xmlns:r="http://schemas.openxmlformats.org/officeDocument/2006/relationships" xmlns:m="http://schemas.openxmlformats.org/officeDocument/2006/math" xmlns:v="urn:schemas-microsoft-com:vml" xmlns:wp14="http://schemas.microsoft.com/office/word/2010/wordprocessingDrawing" xmlns:wp="http://schemas.openxmlformats.org/drawingml/2006/wordprocessingDrawing" xmlns:w10="urn:schemas-microsoft-com:office:word" xmlns:w="http://schemas.openxmlformats.org/wordprocessingml/2006/main" xmlns:w14="http://schemas.microsoft.com/office/word/2010/wordml" xmlns:w15="http://schemas.microsoft.com/office/word/2012/wordml" xmlns:w16cex="http://schemas.microsoft.com/office/word/2018/wordml/cex" xmlns:w16cid="http://schemas.microsoft.com/office/word/2016/wordml/cid" xmlns:w16="http://schemas.microsoft.com/office/word/2018/wordml" xmlns:w16du="http://schemas.microsoft.com/office/word/2023/wordml/word16du" xmlns:w16sdtdh="http://schemas.microsoft.com/office/word/2020/wordml/sdtdatahash" xmlns:w16se="http://schemas.microsoft.com/office/word/2015/wordml/symex" xmlns:wpg="http://schemas.microsoft.com/office/word/2010/wordprocessingGroup" xmlns:wpi="http://schemas.microsoft.com/office/word/2010/wordprocessingInk" xmlns:wne="http://schemas.microsoft.com/office/word/2006/wordml" xmlns:wps="http://schemas.microsoft.com/office/word/2010/wordprocessingShape" mc:Ignorable="w14 w15 w16se w16cid w16 w16cex w16sdtdh w16du wp14">
+<w:document xmlns:wpc="http://schemas.microsoft.com/office/word/2010/wordprocessingCanvas" xmlns:cx="http://schemas.microsoft.com/office/drawing/2014/chartex" xmlns:cx1="http://schemas.microsoft.com/office/drawing/2015/9/8/chartex" xmlns:cx2="http://schemas.microsoft.com/office/drawing/2015/10/21/chartex" xmlns:cx3="http://schemas.microsoft.com/office/drawing/2016/5/9/chartex" xmlns:cx4="http://schemas.microsoft.com/office/drawing/2016/5/10/chartex" xmlns:cx5="http://schemas.microsoft.com/office/drawing/2016/5/11/chartex" xmlns:cx6="http://schemas.microsoft.com/office/drawing/2016/5/12/chartex" xmlns:cx7="http://schemas.microsoft.com/office/drawing/2016/5/13/chartex" xmlns:cx8="http://schemas.microsoft.com/office/drawing/2016/5/14/chartex" xmlns:mc="http://schemas.openxmlformats.org/markup-compatibility/2006" xmlns:aink="http://schemas.microsoft.com/office/drawing/2016/ink" xmlns:am3d="http://schemas.microsoft.com/office/drawing/2017/model3d" xmlns:o="urn:schemas-microsoft-com:office:office" xmlns:oel="http://schemas.microsoft.com/office/2019/extlst" xmlns:r="http://schemas.openxmlformats.org/officeDocument/2006/relationships" xmlns:m="http://schemas.openxmlformats.org/officeDocument/2006/math" xmlns:v="urn:schemas-microsoft-com:vml" xmlns:wp14="http://schemas.microsoft.com/office/word/2010/wordprocessingDrawing" xmlns:wp="http://schemas.openxmlformats.org/drawingml/2006/wordprocessingDrawing" xmlns:w10="urn:schemas-microsoft-com:office:word" xmlns:w="http://schemas.openxmlformats.org/wordprocessingml/2006/main" xmlns:w14="http://schemas.microsoft.com/office/word/2010/wordml" xmlns:w15="http://schemas.microsoft.com/office/word/2012/wordml" xmlns:w16cex="http://schemas.microsoft.com/office/word/2018/wordml/cex" xmlns:w16cid="http://schemas.microsoft.com/office/word/2016/wordml/cid" xmlns:w16="http://schemas.microsoft.com/office/word/2018/wordml" xmlns:w16du="http://schemas.microsoft.com/office/word/2023/wordml/word16du" xmlns:w16sdtdh="http://schemas.microsoft.com/office/word/2020/wordml/sdtdatahash" xmlns:w16sdtfl="http://schemas.microsoft.com/office/word/2024/wordml/sdtformatlock" xmlns:w16se="http://schemas.microsoft.com/office/word/2015/wordml/symex" xmlns:wpg="http://schemas.microsoft.com/office/word/2010/wordprocessingGroup" xmlns:wpi="http://schemas.microsoft.com/office/word/2010/wordprocessingInk" xmlns:wne="http://schemas.microsoft.com/office/word/2006/wordml" xmlns:wps="http://schemas.microsoft.com/office/word/2010/wordprocessingShape" mc:Ignorable="w14 w15 w16se w16cid w16 w16cex w16sdtdh w16sdtfl w16du wp14">
   <w:body>
     <w:p>
       <w:r>
@@ -106,71 +106,29 @@
           <w:sz w:val="36"/>
           <w:szCs w:val="32"/>
         </w:rPr>
-        <w:t xml:space="preserve">{style </w:t>
-      </w:r>
-      <w:proofErr w:type="spellStart"/>
-      <w:r>
-        <w:rPr>
-          <w:sz w:val="36"/>
-          <w:szCs w:val="32"/>
-        </w:rPr>
-        <w:t>testProperty</w:t>
-      </w:r>
-      <w:proofErr w:type="spellEnd"/>
-      <w:r>
-        <w:rPr>
-          <w:sz w:val="36"/>
-          <w:szCs w:val="32"/>
-        </w:rPr>
-        <w:t>}</w:t>
+        <w:t>{style testProperty}</w:t>
       </w:r>
     </w:p>
     <w:p/>
     <w:p>
-      <w:proofErr w:type="spellStart"/>
-      <w:r>
-        <w:t>AutoLink</w:t>
-      </w:r>
-      <w:proofErr w:type="spellEnd"/>
-      <w:r>
-        <w:t>-&gt;</w:t>
-      </w:r>
-    </w:p>
-    <w:p>
-      <w:r>
-        <w:t xml:space="preserve">{*auto </w:t>
-      </w:r>
-      <w:proofErr w:type="spellStart"/>
-      <w:r>
-        <w:t>autoLink</w:t>
-      </w:r>
-      <w:proofErr w:type="spellEnd"/>
-      <w:r>
-        <w:t>}</w:t>
+      <w:r>
+        <w:t>AutoLink-&gt;</w:t>
+      </w:r>
+    </w:p>
+    <w:p>
+      <w:r>
+        <w:t>{*auto autoLink}</w:t>
       </w:r>
     </w:p>
     <w:p/>
     <w:p>
-      <w:proofErr w:type="spellStart"/>
-      <w:r>
-        <w:t>HyperLink</w:t>
-      </w:r>
-      <w:proofErr w:type="spellEnd"/>
-      <w:r>
-        <w:t>-&gt;</w:t>
-      </w:r>
-    </w:p>
-    <w:p>
-      <w:r>
-        <w:t>{*</w:t>
-      </w:r>
-      <w:proofErr w:type="spellStart"/>
-      <w:r>
-        <w:t>linkToCOP</w:t>
-      </w:r>
-      <w:proofErr w:type="spellEnd"/>
-      <w:r>
-        <w:t>}</w:t>
+      <w:r>
+        <w:t>HyperLink-&gt;</w:t>
+      </w:r>
+    </w:p>
+    <w:p>
+      <w:r>
+        <w:t>{*linkToCOP}</w:t>
       </w:r>
     </w:p>
     <w:p/>
@@ -181,15 +139,7 @@
     </w:p>
     <w:p>
       <w:r>
-        <w:t xml:space="preserve">{style </w:t>
-      </w:r>
-      <w:proofErr w:type="spellStart"/>
-      <w:r>
-        <w:t>cust_first_name</w:t>
-      </w:r>
-      <w:proofErr w:type="spellEnd"/>
-      <w:r>
-        <w:t>}</w:t>
+        <w:t>{style cust_first_name}</w:t>
       </w:r>
     </w:p>
     <w:p/>
@@ -200,15 +150,7 @@
     </w:p>
     <w:p>
       <w:r>
-        <w:t xml:space="preserve">{?insert </w:t>
-      </w:r>
-      <w:proofErr w:type="spellStart"/>
-      <w:r>
-        <w:t>document_to_insert</w:t>
-      </w:r>
-      <w:proofErr w:type="spellEnd"/>
-      <w:r>
-        <w:t>}</w:t>
+        <w:t>{?insert document_to_insert}</w:t>
       </w:r>
     </w:p>
     <w:p/>
@@ -281,7 +223,6 @@
               </w:rPr>
               <w:t>{</w:t>
             </w:r>
-            <w:proofErr w:type="spellStart"/>
             <w:r>
               <w:rPr>
                 <w:sz w:val="32"/>
@@ -289,7 +230,6 @@
               </w:rPr>
               <w:t>testProperty</w:t>
             </w:r>
-            <w:proofErr w:type="spellEnd"/>
             <w:r>
               <w:rPr>
                 <w:sz w:val="32"/>
@@ -308,6 +248,36 @@
           <w:szCs w:val="32"/>
         </w:rPr>
       </w:pPr>
+    </w:p>
+    <w:p>
+      <w:pPr>
+        <w:rPr>
+          <w:sz w:val="32"/>
+          <w:szCs w:val="32"/>
+        </w:rPr>
+      </w:pPr>
+      <w:r>
+        <w:rPr>
+          <w:sz w:val="32"/>
+          <w:szCs w:val="32"/>
+        </w:rPr>
+        <w:t>Raw tag</w:t>
+      </w:r>
+    </w:p>
+    <w:p>
+      <w:pPr>
+        <w:rPr>
+          <w:sz w:val="32"/>
+          <w:szCs w:val="32"/>
+        </w:rPr>
+      </w:pPr>
+      <w:r>
+        <w:rPr>
+          <w:sz w:val="32"/>
+          <w:szCs w:val="32"/>
+        </w:rPr>
+        <w:t>{@bold}</w:t>
+      </w:r>
     </w:p>
     <w:sectPr>
       <w:headerReference w:type="default" r:id="rId7"/>
@@ -321,7 +291,7 @@
 </file>
 
 <file path=word/endnotes.xml><?xml version="1.0" encoding="utf-8"?>
-<w:endnotes xmlns:wpc="http://schemas.microsoft.com/office/word/2010/wordprocessingCanvas" xmlns:cx="http://schemas.microsoft.com/office/drawing/2014/chartex" xmlns:cx1="http://schemas.microsoft.com/office/drawing/2015/9/8/chartex" xmlns:cx2="http://schemas.microsoft.com/office/drawing/2015/10/21/chartex" xmlns:cx3="http://schemas.microsoft.com/office/drawing/2016/5/9/chartex" xmlns:cx4="http://schemas.microsoft.com/office/drawing/2016/5/10/chartex" xmlns:cx5="http://schemas.microsoft.com/office/drawing/2016/5/11/chartex" xmlns:cx6="http://schemas.microsoft.com/office/drawing/2016/5/12/chartex" xmlns:cx7="http://schemas.microsoft.com/office/drawing/2016/5/13/chartex" xmlns:cx8="http://schemas.microsoft.com/office/drawing/2016/5/14/chartex" xmlns:mc="http://schemas.openxmlformats.org/markup-compatibility/2006" xmlns:aink="http://schemas.microsoft.com/office/drawing/2016/ink" xmlns:am3d="http://schemas.microsoft.com/office/drawing/2017/model3d" xmlns:o="urn:schemas-microsoft-com:office:office" xmlns:oel="http://schemas.microsoft.com/office/2019/extlst" xmlns:r="http://schemas.openxmlformats.org/officeDocument/2006/relationships" xmlns:m="http://schemas.openxmlformats.org/officeDocument/2006/math" xmlns:v="urn:schemas-microsoft-com:vml" xmlns:wp14="http://schemas.microsoft.com/office/word/2010/wordprocessingDrawing" xmlns:wp="http://schemas.openxmlformats.org/drawingml/2006/wordprocessingDrawing" xmlns:w10="urn:schemas-microsoft-com:office:word" xmlns:w="http://schemas.openxmlformats.org/wordprocessingml/2006/main" xmlns:w14="http://schemas.microsoft.com/office/word/2010/wordml" xmlns:w15="http://schemas.microsoft.com/office/word/2012/wordml" xmlns:w16cex="http://schemas.microsoft.com/office/word/2018/wordml/cex" xmlns:w16cid="http://schemas.microsoft.com/office/word/2016/wordml/cid" xmlns:w16="http://schemas.microsoft.com/office/word/2018/wordml" xmlns:w16du="http://schemas.microsoft.com/office/word/2023/wordml/word16du" xmlns:w16sdtdh="http://schemas.microsoft.com/office/word/2020/wordml/sdtdatahash" xmlns:w16se="http://schemas.microsoft.com/office/word/2015/wordml/symex" xmlns:wpg="http://schemas.microsoft.com/office/word/2010/wordprocessingGroup" xmlns:wpi="http://schemas.microsoft.com/office/word/2010/wordprocessingInk" xmlns:wne="http://schemas.microsoft.com/office/word/2006/wordml" xmlns:wps="http://schemas.microsoft.com/office/word/2010/wordprocessingShape" mc:Ignorable="w14 w15 w16se w16cid w16 w16cex w16sdtdh w16du wp14">
+<w:endnotes xmlns:wpc="http://schemas.microsoft.com/office/word/2010/wordprocessingCanvas" xmlns:cx="http://schemas.microsoft.com/office/drawing/2014/chartex" xmlns:cx1="http://schemas.microsoft.com/office/drawing/2015/9/8/chartex" xmlns:cx2="http://schemas.microsoft.com/office/drawing/2015/10/21/chartex" xmlns:cx3="http://schemas.microsoft.com/office/drawing/2016/5/9/chartex" xmlns:cx4="http://schemas.microsoft.com/office/drawing/2016/5/10/chartex" xmlns:cx5="http://schemas.microsoft.com/office/drawing/2016/5/11/chartex" xmlns:cx6="http://schemas.microsoft.com/office/drawing/2016/5/12/chartex" xmlns:cx7="http://schemas.microsoft.com/office/drawing/2016/5/13/chartex" xmlns:cx8="http://schemas.microsoft.com/office/drawing/2016/5/14/chartex" xmlns:mc="http://schemas.openxmlformats.org/markup-compatibility/2006" xmlns:aink="http://schemas.microsoft.com/office/drawing/2016/ink" xmlns:am3d="http://schemas.microsoft.com/office/drawing/2017/model3d" xmlns:o="urn:schemas-microsoft-com:office:office" xmlns:oel="http://schemas.microsoft.com/office/2019/extlst" xmlns:r="http://schemas.openxmlformats.org/officeDocument/2006/relationships" xmlns:m="http://schemas.openxmlformats.org/officeDocument/2006/math" xmlns:v="urn:schemas-microsoft-com:vml" xmlns:wp14="http://schemas.microsoft.com/office/word/2010/wordprocessingDrawing" xmlns:wp="http://schemas.openxmlformats.org/drawingml/2006/wordprocessingDrawing" xmlns:w10="urn:schemas-microsoft-com:office:word" xmlns:w="http://schemas.openxmlformats.org/wordprocessingml/2006/main" xmlns:w14="http://schemas.microsoft.com/office/word/2010/wordml" xmlns:w15="http://schemas.microsoft.com/office/word/2012/wordml" xmlns:w16cex="http://schemas.microsoft.com/office/word/2018/wordml/cex" xmlns:w16cid="http://schemas.microsoft.com/office/word/2016/wordml/cid" xmlns:w16="http://schemas.microsoft.com/office/word/2018/wordml" xmlns:w16du="http://schemas.microsoft.com/office/word/2023/wordml/word16du" xmlns:w16sdtdh="http://schemas.microsoft.com/office/word/2020/wordml/sdtdatahash" xmlns:w16sdtfl="http://schemas.microsoft.com/office/word/2024/wordml/sdtformatlock" xmlns:w16se="http://schemas.microsoft.com/office/word/2015/wordml/symex" xmlns:wpg="http://schemas.microsoft.com/office/word/2010/wordprocessingGroup" xmlns:wpi="http://schemas.microsoft.com/office/word/2010/wordprocessingInk" xmlns:wne="http://schemas.microsoft.com/office/word/2006/wordml" xmlns:wps="http://schemas.microsoft.com/office/word/2010/wordprocessingShape" mc:Ignorable="w14 w15 w16se w16cid w16 w16cex w16sdtdh w16sdtfl w16du wp14">
   <w:endnote w:type="separator" w:id="-1">
     <w:p>
       <w:pPr>
@@ -346,7 +316,7 @@
 </file>
 
 <file path=word/footnotes.xml><?xml version="1.0" encoding="utf-8"?>
-<w:footnotes xmlns:wpc="http://schemas.microsoft.com/office/word/2010/wordprocessingCanvas" xmlns:cx="http://schemas.microsoft.com/office/drawing/2014/chartex" xmlns:cx1="http://schemas.microsoft.com/office/drawing/2015/9/8/chartex" xmlns:cx2="http://schemas.microsoft.com/office/drawing/2015/10/21/chartex" xmlns:cx3="http://schemas.microsoft.com/office/drawing/2016/5/9/chartex" xmlns:cx4="http://schemas.microsoft.com/office/drawing/2016/5/10/chartex" xmlns:cx5="http://schemas.microsoft.com/office/drawing/2016/5/11/chartex" xmlns:cx6="http://schemas.microsoft.com/office/drawing/2016/5/12/chartex" xmlns:cx7="http://schemas.microsoft.com/office/drawing/2016/5/13/chartex" xmlns:cx8="http://schemas.microsoft.com/office/drawing/2016/5/14/chartex" xmlns:mc="http://schemas.openxmlformats.org/markup-compatibility/2006" xmlns:aink="http://schemas.microsoft.com/office/drawing/2016/ink" xmlns:am3d="http://schemas.microsoft.com/office/drawing/2017/model3d" xmlns:o="urn:schemas-microsoft-com:office:office" xmlns:oel="http://schemas.microsoft.com/office/2019/extlst" xmlns:r="http://schemas.openxmlformats.org/officeDocument/2006/relationships" xmlns:m="http://schemas.openxmlformats.org/officeDocument/2006/math" xmlns:v="urn:schemas-microsoft-com:vml" xmlns:wp14="http://schemas.microsoft.com/office/word/2010/wordprocessingDrawing" xmlns:wp="http://schemas.openxmlformats.org/drawingml/2006/wordprocessingDrawing" xmlns:w10="urn:schemas-microsoft-com:office:word" xmlns:w="http://schemas.openxmlformats.org/wordprocessingml/2006/main" xmlns:w14="http://schemas.microsoft.com/office/word/2010/wordml" xmlns:w15="http://schemas.microsoft.com/office/word/2012/wordml" xmlns:w16cex="http://schemas.microsoft.com/office/word/2018/wordml/cex" xmlns:w16cid="http://schemas.microsoft.com/office/word/2016/wordml/cid" xmlns:w16="http://schemas.microsoft.com/office/word/2018/wordml" xmlns:w16du="http://schemas.microsoft.com/office/word/2023/wordml/word16du" xmlns:w16sdtdh="http://schemas.microsoft.com/office/word/2020/wordml/sdtdatahash" xmlns:w16se="http://schemas.microsoft.com/office/word/2015/wordml/symex" xmlns:wpg="http://schemas.microsoft.com/office/word/2010/wordprocessingGroup" xmlns:wpi="http://schemas.microsoft.com/office/word/2010/wordprocessingInk" xmlns:wne="http://schemas.microsoft.com/office/word/2006/wordml" xmlns:wps="http://schemas.microsoft.com/office/word/2010/wordprocessingShape" mc:Ignorable="w14 w15 w16se w16cid w16 w16cex w16sdtdh w16du wp14">
+<w:footnotes xmlns:wpc="http://schemas.microsoft.com/office/word/2010/wordprocessingCanvas" xmlns:cx="http://schemas.microsoft.com/office/drawing/2014/chartex" xmlns:cx1="http://schemas.microsoft.com/office/drawing/2015/9/8/chartex" xmlns:cx2="http://schemas.microsoft.com/office/drawing/2015/10/21/chartex" xmlns:cx3="http://schemas.microsoft.com/office/drawing/2016/5/9/chartex" xmlns:cx4="http://schemas.microsoft.com/office/drawing/2016/5/10/chartex" xmlns:cx5="http://schemas.microsoft.com/office/drawing/2016/5/11/chartex" xmlns:cx6="http://schemas.microsoft.com/office/drawing/2016/5/12/chartex" xmlns:cx7="http://schemas.microsoft.com/office/drawing/2016/5/13/chartex" xmlns:cx8="http://schemas.microsoft.com/office/drawing/2016/5/14/chartex" xmlns:mc="http://schemas.openxmlformats.org/markup-compatibility/2006" xmlns:aink="http://schemas.microsoft.com/office/drawing/2016/ink" xmlns:am3d="http://schemas.microsoft.com/office/drawing/2017/model3d" xmlns:o="urn:schemas-microsoft-com:office:office" xmlns:oel="http://schemas.microsoft.com/office/2019/extlst" xmlns:r="http://schemas.openxmlformats.org/officeDocument/2006/relationships" xmlns:m="http://schemas.openxmlformats.org/officeDocument/2006/math" xmlns:v="urn:schemas-microsoft-com:vml" xmlns:wp14="http://schemas.microsoft.com/office/word/2010/wordprocessingDrawing" xmlns:wp="http://schemas.openxmlformats.org/drawingml/2006/wordprocessingDrawing" xmlns:w10="urn:schemas-microsoft-com:office:word" xmlns:w="http://schemas.openxmlformats.org/wordprocessingml/2006/main" xmlns:w14="http://schemas.microsoft.com/office/word/2010/wordml" xmlns:w15="http://schemas.microsoft.com/office/word/2012/wordml" xmlns:w16cex="http://schemas.microsoft.com/office/word/2018/wordml/cex" xmlns:w16cid="http://schemas.microsoft.com/office/word/2016/wordml/cid" xmlns:w16="http://schemas.microsoft.com/office/word/2018/wordml" xmlns:w16du="http://schemas.microsoft.com/office/word/2023/wordml/word16du" xmlns:w16sdtdh="http://schemas.microsoft.com/office/word/2020/wordml/sdtdatahash" xmlns:w16sdtfl="http://schemas.microsoft.com/office/word/2024/wordml/sdtformatlock" xmlns:w16se="http://schemas.microsoft.com/office/word/2015/wordml/symex" xmlns:wpg="http://schemas.microsoft.com/office/word/2010/wordprocessingGroup" xmlns:wpi="http://schemas.microsoft.com/office/word/2010/wordprocessingInk" xmlns:wne="http://schemas.microsoft.com/office/word/2006/wordml" xmlns:wps="http://schemas.microsoft.com/office/word/2010/wordprocessingShape" mc:Ignorable="w14 w15 w16se w16cid w16 w16cex w16sdtdh w16sdtfl w16du wp14">
   <w:footnote w:type="separator" w:id="-1">
     <w:p>
       <w:pPr>
@@ -371,28 +341,20 @@
 </file>
 
 <file path=word/header1.xml><?xml version="1.0" encoding="utf-8"?>
-<w:hdr xmlns:wpc="http://schemas.microsoft.com/office/word/2010/wordprocessingCanvas" xmlns:cx="http://schemas.microsoft.com/office/drawing/2014/chartex" xmlns:cx1="http://schemas.microsoft.com/office/drawing/2015/9/8/chartex" xmlns:cx2="http://schemas.microsoft.com/office/drawing/2015/10/21/chartex" xmlns:cx3="http://schemas.microsoft.com/office/drawing/2016/5/9/chartex" xmlns:cx4="http://schemas.microsoft.com/office/drawing/2016/5/10/chartex" xmlns:cx5="http://schemas.microsoft.com/office/drawing/2016/5/11/chartex" xmlns:cx6="http://schemas.microsoft.com/office/drawing/2016/5/12/chartex" xmlns:cx7="http://schemas.microsoft.com/office/drawing/2016/5/13/chartex" xmlns:cx8="http://schemas.microsoft.com/office/drawing/2016/5/14/chartex" xmlns:mc="http://schemas.openxmlformats.org/markup-compatibility/2006" xmlns:aink="http://schemas.microsoft.com/office/drawing/2016/ink" xmlns:am3d="http://schemas.microsoft.com/office/drawing/2017/model3d" xmlns:o="urn:schemas-microsoft-com:office:office" xmlns:oel="http://schemas.microsoft.com/office/2019/extlst" xmlns:r="http://schemas.openxmlformats.org/officeDocument/2006/relationships" xmlns:m="http://schemas.openxmlformats.org/officeDocument/2006/math" xmlns:v="urn:schemas-microsoft-com:vml" xmlns:wp14="http://schemas.microsoft.com/office/word/2010/wordprocessingDrawing" xmlns:wp="http://schemas.openxmlformats.org/drawingml/2006/wordprocessingDrawing" xmlns:w10="urn:schemas-microsoft-com:office:word" xmlns:w="http://schemas.openxmlformats.org/wordprocessingml/2006/main" xmlns:w14="http://schemas.microsoft.com/office/word/2010/wordml" xmlns:w15="http://schemas.microsoft.com/office/word/2012/wordml" xmlns:w16cex="http://schemas.microsoft.com/office/word/2018/wordml/cex" xmlns:w16cid="http://schemas.microsoft.com/office/word/2016/wordml/cid" xmlns:w16="http://schemas.microsoft.com/office/word/2018/wordml" xmlns:w16du="http://schemas.microsoft.com/office/word/2023/wordml/word16du" xmlns:w16sdtdh="http://schemas.microsoft.com/office/word/2020/wordml/sdtdatahash" xmlns:w16se="http://schemas.microsoft.com/office/word/2015/wordml/symex" xmlns:wpg="http://schemas.microsoft.com/office/word/2010/wordprocessingGroup" xmlns:wpi="http://schemas.microsoft.com/office/word/2010/wordprocessingInk" xmlns:wne="http://schemas.microsoft.com/office/word/2006/wordml" xmlns:wps="http://schemas.microsoft.com/office/word/2010/wordprocessingShape" mc:Ignorable="w14 w15 w16se w16cid w16 w16cex w16sdtdh w16du wp14">
+<w:hdr xmlns:wpc="http://schemas.microsoft.com/office/word/2010/wordprocessingCanvas" xmlns:cx="http://schemas.microsoft.com/office/drawing/2014/chartex" xmlns:cx1="http://schemas.microsoft.com/office/drawing/2015/9/8/chartex" xmlns:cx2="http://schemas.microsoft.com/office/drawing/2015/10/21/chartex" xmlns:cx3="http://schemas.microsoft.com/office/drawing/2016/5/9/chartex" xmlns:cx4="http://schemas.microsoft.com/office/drawing/2016/5/10/chartex" xmlns:cx5="http://schemas.microsoft.com/office/drawing/2016/5/11/chartex" xmlns:cx6="http://schemas.microsoft.com/office/drawing/2016/5/12/chartex" xmlns:cx7="http://schemas.microsoft.com/office/drawing/2016/5/13/chartex" xmlns:cx8="http://schemas.microsoft.com/office/drawing/2016/5/14/chartex" xmlns:mc="http://schemas.openxmlformats.org/markup-compatibility/2006" xmlns:aink="http://schemas.microsoft.com/office/drawing/2016/ink" xmlns:am3d="http://schemas.microsoft.com/office/drawing/2017/model3d" xmlns:o="urn:schemas-microsoft-com:office:office" xmlns:oel="http://schemas.microsoft.com/office/2019/extlst" xmlns:r="http://schemas.openxmlformats.org/officeDocument/2006/relationships" xmlns:m="http://schemas.openxmlformats.org/officeDocument/2006/math" xmlns:v="urn:schemas-microsoft-com:vml" xmlns:wp14="http://schemas.microsoft.com/office/word/2010/wordprocessingDrawing" xmlns:wp="http://schemas.openxmlformats.org/drawingml/2006/wordprocessingDrawing" xmlns:w10="urn:schemas-microsoft-com:office:word" xmlns:w="http://schemas.openxmlformats.org/wordprocessingml/2006/main" xmlns:w14="http://schemas.microsoft.com/office/word/2010/wordml" xmlns:w15="http://schemas.microsoft.com/office/word/2012/wordml" xmlns:w16cex="http://schemas.microsoft.com/office/word/2018/wordml/cex" xmlns:w16cid="http://schemas.microsoft.com/office/word/2016/wordml/cid" xmlns:w16="http://schemas.microsoft.com/office/word/2018/wordml" xmlns:w16du="http://schemas.microsoft.com/office/word/2023/wordml/word16du" xmlns:w16sdtdh="http://schemas.microsoft.com/office/word/2020/wordml/sdtdatahash" xmlns:w16sdtfl="http://schemas.microsoft.com/office/word/2024/wordml/sdtformatlock" xmlns:w16se="http://schemas.microsoft.com/office/word/2015/wordml/symex" xmlns:wpg="http://schemas.microsoft.com/office/word/2010/wordprocessingGroup" xmlns:wpi="http://schemas.microsoft.com/office/word/2010/wordprocessingInk" xmlns:wne="http://schemas.microsoft.com/office/word/2006/wordml" xmlns:wps="http://schemas.microsoft.com/office/word/2010/wordprocessingShape" mc:Ignorable="w14 w15 w16se w16cid w16 w16cex w16sdtdh w16sdtfl w16du wp14">
   <w:p>
     <w:pPr>
       <w:pStyle w:val="Header"/>
     </w:pPr>
     <w:r>
-      <w:t xml:space="preserve">{watermark </w:t>
-    </w:r>
-    <w:proofErr w:type="spellStart"/>
-    <w:r>
-      <w:t>wm_name</w:t>
-    </w:r>
-    <w:proofErr w:type="spellEnd"/>
-    <w:r>
-      <w:t>}</w:t>
+      <w:t>{watermark wm_name}</w:t>
     </w:r>
   </w:p>
 </w:hdr>
 </file>
 
 <file path=word/styles.xml><?xml version="1.0" encoding="utf-8"?>
-<w:styles xmlns:mc="http://schemas.openxmlformats.org/markup-compatibility/2006" xmlns:r="http://schemas.openxmlformats.org/officeDocument/2006/relationships" xmlns:w="http://schemas.openxmlformats.org/wordprocessingml/2006/main" xmlns:w14="http://schemas.microsoft.com/office/word/2010/wordml" xmlns:w15="http://schemas.microsoft.com/office/word/2012/wordml" xmlns:w16cex="http://schemas.microsoft.com/office/word/2018/wordml/cex" xmlns:w16cid="http://schemas.microsoft.com/office/word/2016/wordml/cid" xmlns:w16="http://schemas.microsoft.com/office/word/2018/wordml" xmlns:w16du="http://schemas.microsoft.com/office/word/2023/wordml/word16du" xmlns:w16sdtdh="http://schemas.microsoft.com/office/word/2020/wordml/sdtdatahash" xmlns:w16se="http://schemas.microsoft.com/office/word/2015/wordml/symex" mc:Ignorable="w14 w15 w16se w16cid w16 w16cex w16sdtdh w16du">
+<w:styles xmlns:mc="http://schemas.openxmlformats.org/markup-compatibility/2006" xmlns:r="http://schemas.openxmlformats.org/officeDocument/2006/relationships" xmlns:w="http://schemas.openxmlformats.org/wordprocessingml/2006/main" xmlns:w14="http://schemas.microsoft.com/office/word/2010/wordml" xmlns:w15="http://schemas.microsoft.com/office/word/2012/wordml" xmlns:w16cex="http://schemas.microsoft.com/office/word/2018/wordml/cex" xmlns:w16cid="http://schemas.microsoft.com/office/word/2016/wordml/cid" xmlns:w16="http://schemas.microsoft.com/office/word/2018/wordml" xmlns:w16du="http://schemas.microsoft.com/office/word/2023/wordml/word16du" xmlns:w16sdtdh="http://schemas.microsoft.com/office/word/2020/wordml/sdtdatahash" xmlns:w16sdtfl="http://schemas.microsoft.com/office/word/2024/wordml/sdtformatlock" xmlns:w16se="http://schemas.microsoft.com/office/word/2015/wordml/symex" mc:Ignorable="w14 w15 w16se w16cid w16 w16cex w16sdtdh w16sdtfl w16du">
   <w:docDefaults>
     <w:rPrDefault>
       <w:rPr>
@@ -792,6 +754,7 @@
   <w:style w:type="character" w:default="1" w:styleId="DefaultParagraphFont">
     <w:name w:val="Default Paragraph Font"/>
     <w:uiPriority w:val="1"/>
+    <w:semiHidden/>
     <w:unhideWhenUsed/>
   </w:style>
   <w:style w:type="table" w:default="1" w:styleId="TableNormal">

</xml_diff>